<commit_message>
docs: update Word documents with detalle_factura_ingresos and 57 endpoints coverage matrix
</commit_message>
<xml_diff>
--- a/docs/base_de_datos.docx
+++ b/docs/base_de_datos.docx
@@ -1713,7 +1713,7 @@
                 <w:sz w:val="17"/>
                 <w:szCs w:val="17"/>
               </w:rPr>
-              <w:t xml:space="preserve">Facturas B2B procesadas por OCR/XML</w:t>
+              <w:t xml:space="preserve">Facturas B2B procesadas por OCR/XML (Cabecera)</w:t>
             </w:r>
           </w:p>
         </w:tc>
@@ -1740,6 +1740,114 @@
                 <w:szCs w:val="17"/>
               </w:rPr>
               <w:t xml:space="preserve">id, rut_emisor, total</w:t>
+            </w:r>
+          </w:p>
+        </w:tc>
+      </w:tr>
+      <w:tr>
+        <w:tc>
+          <w:tcPr>
+            <w:tcW w:type="pct" w:w="25%"/>
+            <w:tcMar>
+              <w:top w:type="dxa" w:w="90"/>
+              <w:left w:type="dxa" w:w="110"/>
+              <w:bottom w:type="dxa" w:w="90"/>
+              <w:right w:type="dxa" w:w="110"/>
+            </w:tcMar>
+          </w:tcPr>
+          <w:p>
+            <w:pPr>
+              <w:jc w:val="left"/>
+            </w:pPr>
+            <w:r>
+              <w:rPr>
+                <w:rFonts w:ascii="Calibri" w:cs="Calibri" w:eastAsia="Calibri" w:hAnsi="Calibri"/>
+                <w:b w:val="false"/>
+                <w:bCs w:val="false"/>
+                <w:color w:val="1E293B"/>
+                <w:sz w:val="17"/>
+                <w:szCs w:val="17"/>
+              </w:rPr>
+              <w:t xml:space="preserve">detalle_factura_ingresos</w:t>
+            </w:r>
+          </w:p>
+        </w:tc>
+        <w:tc>
+          <w:tcPr>
+            <w:tcW w:type="pct" w:w="18%"/>
+            <w:tcMar>
+              <w:top w:type="dxa" w:w="90"/>
+              <w:left w:type="dxa" w:w="110"/>
+              <w:bottom w:type="dxa" w:w="90"/>
+              <w:right w:type="dxa" w:w="110"/>
+            </w:tcMar>
+          </w:tcPr>
+          <w:p>
+            <w:pPr>
+              <w:jc w:val="left"/>
+            </w:pPr>
+            <w:r>
+              <w:rPr>
+                <w:rFonts w:ascii="Calibri" w:cs="Calibri" w:eastAsia="Calibri" w:hAnsi="Calibri"/>
+                <w:b w:val="false"/>
+                <w:bCs w:val="false"/>
+                <w:color w:val="1E293B"/>
+                <w:sz w:val="17"/>
+                <w:szCs w:val="17"/>
+              </w:rPr>
+              <w:t xml:space="preserve">Dual (PG + SQL)</w:t>
+            </w:r>
+          </w:p>
+        </w:tc>
+        <w:tc>
+          <w:tcPr>
+            <w:tcMar>
+              <w:top w:type="dxa" w:w="90"/>
+              <w:left w:type="dxa" w:w="110"/>
+              <w:bottom w:type="dxa" w:w="90"/>
+              <w:right w:type="dxa" w:w="110"/>
+            </w:tcMar>
+          </w:tcPr>
+          <w:p>
+            <w:pPr>
+              <w:jc w:val="left"/>
+            </w:pPr>
+            <w:r>
+              <w:rPr>
+                <w:rFonts w:ascii="Calibri" w:cs="Calibri" w:eastAsia="Calibri" w:hAnsi="Calibri"/>
+                <w:b w:val="false"/>
+                <w:bCs w:val="false"/>
+                <w:color w:val="1E293B"/>
+                <w:sz w:val="17"/>
+                <w:szCs w:val="17"/>
+              </w:rPr>
+              <w:t xml:space="preserve">Lineas de compra, costo unitario, lotes y vencimiento (1:N)</w:t>
+            </w:r>
+          </w:p>
+        </w:tc>
+        <w:tc>
+          <w:tcPr>
+            <w:tcMar>
+              <w:top w:type="dxa" w:w="90"/>
+              <w:left w:type="dxa" w:w="110"/>
+              <w:bottom w:type="dxa" w:w="90"/>
+              <w:right w:type="dxa" w:w="110"/>
+            </w:tcMar>
+          </w:tcPr>
+          <w:p>
+            <w:pPr>
+              <w:jc w:val="left"/>
+            </w:pPr>
+            <w:r>
+              <w:rPr>
+                <w:rFonts w:ascii="Calibri" w:cs="Calibri" w:eastAsia="Calibri" w:hAnsi="Calibri"/>
+                <w:b w:val="false"/>
+                <w:bCs w:val="false"/>
+                <w:color w:val="1E293B"/>
+                <w:sz w:val="17"/>
+                <w:szCs w:val="17"/>
+              </w:rPr>
+              <w:t xml:space="preserve">id, factura_id, producto_id</w:t>
             </w:r>
           </w:p>
         </w:tc>

</xml_diff>

<commit_message>
Documentar el diagrama entidad-relación y las políticas de borrado en el modelo de datos
</commit_message>
<xml_diff>
--- a/docs/base_de_datos.docx
+++ b/docs/base_de_datos.docx
@@ -2095,6 +2095,1409 @@
           <w:szCs w:val="21"/>
         </w:rPr>
         <w:t xml:space="preserve">El esquema respeta fielmente la legislacion chilena: calculo neto e IVA 19% desglosado, soporte de Timbre Electronico DTE (TED) segun formato XML estipulado por el SII y registro del ajuste por Ley de Redondeo (Ley N° 20.956).</w:t>
+      </w:r>
+    </w:p>
+    <w:p>
+      <w:r>
+        <w:rPr>
+          <w:rFonts w:ascii="Calibri" w:hAnsi="Calibri"/>
+          <w:b/>
+          <w:sz w:val="26"/>
+        </w:rPr>
+        <w:t>5. Diagrama Entidad-Relacion</w:t>
+      </w:r>
+    </w:p>
+    <w:p>
+      <w:r>
+        <w:rPr>
+          <w:rFonts w:ascii="Calibri" w:hAnsi="Calibri"/>
+          <w:sz w:val="21"/>
+        </w:rPr>
+        <w:t>El modelo se representa mediante un diagrama entidad-relacion en notacion Chen extendida, disponible en la misma carpeta de evidencias en dos formatos: "Diagrama Base De Datos.svg", que se visualiza directamente en el repositorio, y "Diagrama Base De Datos.mmd", que es su fuente editable en sintaxis Mermaid. Se acompana ademas de "Visor Diagrama.html" para consultarlo en un navegador sin herramientas adicionales.</w:t>
+      </w:r>
+    </w:p>
+    <w:p>
+      <w:r>
+        <w:rPr>
+          <w:rFonts w:ascii="Calibri" w:hAnsi="Calibri"/>
+          <w:sz w:val="21"/>
+        </w:rPr>
+        <w:t>Mantener el diagrama como texto versionado, y no solo como imagen, permite que cada cambio del esquema quede registrado en el historial del repositorio con la misma trazabilidad que las migraciones, y que el diagrama no se desactualice respecto de la base de datos.</w:t>
+      </w:r>
+    </w:p>
+    <w:p>
+      <w:r>
+        <w:rPr>
+          <w:rFonts w:ascii="Calibri" w:hAnsi="Calibri"/>
+          <w:sz w:val="21"/>
+        </w:rPr>
+        <w:t>El diagrama declara 22 relaciones entre 19 entidades. La tabla siguiente las enumera con su cardinalidad, tal como estan definidas en la fuente del diagrama.</w:t>
+      </w:r>
+    </w:p>
+    <w:tbl>
+      <w:tblPr>
+        <w:tblW w:type="pct" w:w="100%"/>
+        <w:tblBorders>
+          <w:top w:val="single" w:color="auto" w:sz="4"/>
+          <w:left w:val="single" w:color="auto" w:sz="4"/>
+          <w:bottom w:val="single" w:color="auto" w:sz="4"/>
+          <w:right w:val="single" w:color="auto" w:sz="4"/>
+          <w:insideH w:val="single" w:color="auto" w:sz="4"/>
+          <w:insideV w:val="single" w:color="auto" w:sz="4"/>
+        </w:tblBorders>
+      </w:tblPr>
+      <w:tblGrid>
+        <w:gridCol w:w="2256"/>
+        <w:gridCol w:w="2256"/>
+        <w:gridCol w:w="2256"/>
+        <w:gridCol w:w="2256"/>
+      </w:tblGrid>
+      <w:tr>
+        <w:tc>
+          <w:tcPr>
+            <w:tcW w:type="dxa" w:w="2256"/>
+          </w:tcPr>
+          <w:p>
+            <w:r/>
+            <w:r>
+              <w:rPr>
+                <w:b/>
+                <w:sz w:val="18"/>
+              </w:rPr>
+              <w:t>Entidad origen</w:t>
+            </w:r>
+          </w:p>
+        </w:tc>
+        <w:tc>
+          <w:tcPr>
+            <w:tcW w:type="dxa" w:w="2256"/>
+          </w:tcPr>
+          <w:p>
+            <w:r/>
+            <w:r>
+              <w:rPr>
+                <w:b/>
+                <w:sz w:val="18"/>
+              </w:rPr>
+              <w:t>Cardinalidad</w:t>
+            </w:r>
+          </w:p>
+        </w:tc>
+        <w:tc>
+          <w:tcPr>
+            <w:tcW w:type="dxa" w:w="2256"/>
+          </w:tcPr>
+          <w:p>
+            <w:r/>
+            <w:r>
+              <w:rPr>
+                <w:b/>
+                <w:sz w:val="18"/>
+              </w:rPr>
+              <w:t>Entidad destino</w:t>
+            </w:r>
+          </w:p>
+        </w:tc>
+        <w:tc>
+          <w:tcPr>
+            <w:tcW w:type="dxa" w:w="2256"/>
+          </w:tcPr>
+          <w:p>
+            <w:r/>
+            <w:r>
+              <w:rPr>
+                <w:b/>
+                <w:sz w:val="18"/>
+              </w:rPr>
+              <w:t>Relacion</w:t>
+            </w:r>
+          </w:p>
+        </w:tc>
+      </w:tr>
+      <w:tr>
+        <w:tc>
+          <w:tcPr>
+            <w:tcW w:type="dxa" w:w="2256"/>
+          </w:tcPr>
+          <w:p>
+            <w:r/>
+            <w:r>
+              <w:rPr>
+                <w:sz w:val="18"/>
+              </w:rPr>
+              <w:t>Planes Facturacion</w:t>
+            </w:r>
+          </w:p>
+        </w:tc>
+        <w:tc>
+          <w:tcPr>
+            <w:tcW w:type="dxa" w:w="2256"/>
+          </w:tcPr>
+          <w:p>
+            <w:r/>
+            <w:r>
+              <w:rPr>
+                <w:sz w:val="18"/>
+              </w:rPr>
+              <w:t>Uno a muchos (0..N)</w:t>
+            </w:r>
+          </w:p>
+        </w:tc>
+        <w:tc>
+          <w:tcPr>
+            <w:tcW w:type="dxa" w:w="2256"/>
+          </w:tcPr>
+          <w:p>
+            <w:r/>
+            <w:r>
+              <w:rPr>
+                <w:sz w:val="18"/>
+              </w:rPr>
+              <w:t>Tenants</w:t>
+            </w:r>
+          </w:p>
+        </w:tc>
+        <w:tc>
+          <w:tcPr>
+            <w:tcW w:type="dxa" w:w="2256"/>
+          </w:tcPr>
+          <w:p>
+            <w:r/>
+            <w:r>
+              <w:rPr>
+                <w:sz w:val="18"/>
+              </w:rPr>
+              <w:t>asigna plan</w:t>
+            </w:r>
+          </w:p>
+        </w:tc>
+      </w:tr>
+      <w:tr>
+        <w:tc>
+          <w:tcPr>
+            <w:tcW w:type="dxa" w:w="2256"/>
+          </w:tcPr>
+          <w:p>
+            <w:r/>
+            <w:r>
+              <w:rPr>
+                <w:sz w:val="18"/>
+              </w:rPr>
+              <w:t>Planes Facturacion</w:t>
+            </w:r>
+          </w:p>
+        </w:tc>
+        <w:tc>
+          <w:tcPr>
+            <w:tcW w:type="dxa" w:w="2256"/>
+          </w:tcPr>
+          <w:p>
+            <w:r/>
+            <w:r>
+              <w:rPr>
+                <w:sz w:val="18"/>
+              </w:rPr>
+              <w:t>Uno a muchos (0..N)</w:t>
+            </w:r>
+          </w:p>
+        </w:tc>
+        <w:tc>
+          <w:tcPr>
+            <w:tcW w:type="dxa" w:w="2256"/>
+          </w:tcPr>
+          <w:p>
+            <w:r/>
+            <w:r>
+              <w:rPr>
+                <w:sz w:val="18"/>
+              </w:rPr>
+              <w:t>Historial Planes</w:t>
+            </w:r>
+          </w:p>
+        </w:tc>
+        <w:tc>
+          <w:tcPr>
+            <w:tcW w:type="dxa" w:w="2256"/>
+          </w:tcPr>
+          <w:p>
+            <w:r/>
+            <w:r>
+              <w:rPr>
+                <w:sz w:val="18"/>
+              </w:rPr>
+              <w:t>registra historial</w:t>
+            </w:r>
+          </w:p>
+        </w:tc>
+      </w:tr>
+      <w:tr>
+        <w:tc>
+          <w:tcPr>
+            <w:tcW w:type="dxa" w:w="2256"/>
+          </w:tcPr>
+          <w:p>
+            <w:r/>
+            <w:r>
+              <w:rPr>
+                <w:sz w:val="18"/>
+              </w:rPr>
+              <w:t>Tenants</w:t>
+            </w:r>
+          </w:p>
+        </w:tc>
+        <w:tc>
+          <w:tcPr>
+            <w:tcW w:type="dxa" w:w="2256"/>
+          </w:tcPr>
+          <w:p>
+            <w:r/>
+            <w:r>
+              <w:rPr>
+                <w:sz w:val="18"/>
+              </w:rPr>
+              <w:t>Uno a muchos (0..N)</w:t>
+            </w:r>
+          </w:p>
+        </w:tc>
+        <w:tc>
+          <w:tcPr>
+            <w:tcW w:type="dxa" w:w="2256"/>
+          </w:tcPr>
+          <w:p>
+            <w:r/>
+            <w:r>
+              <w:rPr>
+                <w:sz w:val="18"/>
+              </w:rPr>
+              <w:t>Usuarios</w:t>
+            </w:r>
+          </w:p>
+        </w:tc>
+        <w:tc>
+          <w:tcPr>
+            <w:tcW w:type="dxa" w:w="2256"/>
+          </w:tcPr>
+          <w:p>
+            <w:r/>
+            <w:r>
+              <w:rPr>
+                <w:sz w:val="18"/>
+              </w:rPr>
+              <w:t>agrupa</w:t>
+            </w:r>
+          </w:p>
+        </w:tc>
+      </w:tr>
+      <w:tr>
+        <w:tc>
+          <w:tcPr>
+            <w:tcW w:type="dxa" w:w="2256"/>
+          </w:tcPr>
+          <w:p>
+            <w:r/>
+            <w:r>
+              <w:rPr>
+                <w:sz w:val="18"/>
+              </w:rPr>
+              <w:t>Tenants</w:t>
+            </w:r>
+          </w:p>
+        </w:tc>
+        <w:tc>
+          <w:tcPr>
+            <w:tcW w:type="dxa" w:w="2256"/>
+          </w:tcPr>
+          <w:p>
+            <w:r/>
+            <w:r>
+              <w:rPr>
+                <w:sz w:val="18"/>
+              </w:rPr>
+              <w:t>Uno a muchos (0..N)</w:t>
+            </w:r>
+          </w:p>
+        </w:tc>
+        <w:tc>
+          <w:tcPr>
+            <w:tcW w:type="dxa" w:w="2256"/>
+          </w:tcPr>
+          <w:p>
+            <w:r/>
+            <w:r>
+              <w:rPr>
+                <w:sz w:val="18"/>
+              </w:rPr>
+              <w:t>Historial Planes</w:t>
+            </w:r>
+          </w:p>
+        </w:tc>
+        <w:tc>
+          <w:tcPr>
+            <w:tcW w:type="dxa" w:w="2256"/>
+          </w:tcPr>
+          <w:p>
+            <w:r/>
+            <w:r>
+              <w:rPr>
+                <w:sz w:val="18"/>
+              </w:rPr>
+              <w:t>posee</w:t>
+            </w:r>
+          </w:p>
+        </w:tc>
+      </w:tr>
+      <w:tr>
+        <w:tc>
+          <w:tcPr>
+            <w:tcW w:type="dxa" w:w="2256"/>
+          </w:tcPr>
+          <w:p>
+            <w:r/>
+            <w:r>
+              <w:rPr>
+                <w:sz w:val="18"/>
+              </w:rPr>
+              <w:t>Tenants</w:t>
+            </w:r>
+          </w:p>
+        </w:tc>
+        <w:tc>
+          <w:tcPr>
+            <w:tcW w:type="dxa" w:w="2256"/>
+          </w:tcPr>
+          <w:p>
+            <w:r/>
+            <w:r>
+              <w:rPr>
+                <w:sz w:val="18"/>
+              </w:rPr>
+              <w:t>Uno a muchos (0..N)</w:t>
+            </w:r>
+          </w:p>
+        </w:tc>
+        <w:tc>
+          <w:tcPr>
+            <w:tcW w:type="dxa" w:w="2256"/>
+          </w:tcPr>
+          <w:p>
+            <w:r/>
+            <w:r>
+              <w:rPr>
+                <w:sz w:val="18"/>
+              </w:rPr>
+              <w:t>Configuracion Sistema</w:t>
+            </w:r>
+          </w:p>
+        </w:tc>
+        <w:tc>
+          <w:tcPr>
+            <w:tcW w:type="dxa" w:w="2256"/>
+          </w:tcPr>
+          <w:p>
+            <w:r/>
+            <w:r>
+              <w:rPr>
+                <w:sz w:val="18"/>
+              </w:rPr>
+              <w:t>personaliza</w:t>
+            </w:r>
+          </w:p>
+        </w:tc>
+      </w:tr>
+      <w:tr>
+        <w:tc>
+          <w:tcPr>
+            <w:tcW w:type="dxa" w:w="2256"/>
+          </w:tcPr>
+          <w:p>
+            <w:r/>
+            <w:r>
+              <w:rPr>
+                <w:sz w:val="18"/>
+              </w:rPr>
+              <w:t>Usuarios</w:t>
+            </w:r>
+          </w:p>
+        </w:tc>
+        <w:tc>
+          <w:tcPr>
+            <w:tcW w:type="dxa" w:w="2256"/>
+          </w:tcPr>
+          <w:p>
+            <w:r/>
+            <w:r>
+              <w:rPr>
+                <w:sz w:val="18"/>
+              </w:rPr>
+              <w:t>Uno a muchos (0..N)</w:t>
+            </w:r>
+          </w:p>
+        </w:tc>
+        <w:tc>
+          <w:tcPr>
+            <w:tcW w:type="dxa" w:w="2256"/>
+          </w:tcPr>
+          <w:p>
+            <w:r/>
+            <w:r>
+              <w:rPr>
+                <w:sz w:val="18"/>
+              </w:rPr>
+              <w:t>Notificaciones Tokens</w:t>
+            </w:r>
+          </w:p>
+        </w:tc>
+        <w:tc>
+          <w:tcPr>
+            <w:tcW w:type="dxa" w:w="2256"/>
+          </w:tcPr>
+          <w:p>
+            <w:r/>
+            <w:r>
+              <w:rPr>
+                <w:sz w:val="18"/>
+              </w:rPr>
+              <w:t>genera</w:t>
+            </w:r>
+          </w:p>
+        </w:tc>
+      </w:tr>
+      <w:tr>
+        <w:tc>
+          <w:tcPr>
+            <w:tcW w:type="dxa" w:w="2256"/>
+          </w:tcPr>
+          <w:p>
+            <w:r/>
+            <w:r>
+              <w:rPr>
+                <w:sz w:val="18"/>
+              </w:rPr>
+              <w:t>Tenants</w:t>
+            </w:r>
+          </w:p>
+        </w:tc>
+        <w:tc>
+          <w:tcPr>
+            <w:tcW w:type="dxa" w:w="2256"/>
+          </w:tcPr>
+          <w:p>
+            <w:r/>
+            <w:r>
+              <w:rPr>
+                <w:sz w:val="18"/>
+              </w:rPr>
+              <w:t>Uno a muchos (0..N)</w:t>
+            </w:r>
+          </w:p>
+        </w:tc>
+        <w:tc>
+          <w:tcPr>
+            <w:tcW w:type="dxa" w:w="2256"/>
+          </w:tcPr>
+          <w:p>
+            <w:r/>
+            <w:r>
+              <w:rPr>
+                <w:sz w:val="18"/>
+              </w:rPr>
+              <w:t>Proveedores</w:t>
+            </w:r>
+          </w:p>
+        </w:tc>
+        <w:tc>
+          <w:tcPr>
+            <w:tcW w:type="dxa" w:w="2256"/>
+          </w:tcPr>
+          <w:p>
+            <w:r/>
+            <w:r>
+              <w:rPr>
+                <w:sz w:val="18"/>
+              </w:rPr>
+              <w:t>gestiona</w:t>
+            </w:r>
+          </w:p>
+        </w:tc>
+      </w:tr>
+      <w:tr>
+        <w:tc>
+          <w:tcPr>
+            <w:tcW w:type="dxa" w:w="2256"/>
+          </w:tcPr>
+          <w:p>
+            <w:r/>
+            <w:r>
+              <w:rPr>
+                <w:sz w:val="18"/>
+              </w:rPr>
+              <w:t>Proveedores</w:t>
+            </w:r>
+          </w:p>
+        </w:tc>
+        <w:tc>
+          <w:tcPr>
+            <w:tcW w:type="dxa" w:w="2256"/>
+          </w:tcPr>
+          <w:p>
+            <w:r/>
+            <w:r>
+              <w:rPr>
+                <w:sz w:val="18"/>
+              </w:rPr>
+              <w:t>Uno a muchos (0..N)</w:t>
+            </w:r>
+          </w:p>
+        </w:tc>
+        <w:tc>
+          <w:tcPr>
+            <w:tcW w:type="dxa" w:w="2256"/>
+          </w:tcPr>
+          <w:p>
+            <w:r/>
+            <w:r>
+              <w:rPr>
+                <w:sz w:val="18"/>
+              </w:rPr>
+              <w:t>Catalogo Borradores</w:t>
+            </w:r>
+          </w:p>
+        </w:tc>
+        <w:tc>
+          <w:tcPr>
+            <w:tcW w:type="dxa" w:w="2256"/>
+          </w:tcPr>
+          <w:p>
+            <w:r/>
+            <w:r>
+              <w:rPr>
+                <w:sz w:val="18"/>
+              </w:rPr>
+              <w:t>propone</w:t>
+            </w:r>
+          </w:p>
+        </w:tc>
+      </w:tr>
+      <w:tr>
+        <w:tc>
+          <w:tcPr>
+            <w:tcW w:type="dxa" w:w="2256"/>
+          </w:tcPr>
+          <w:p>
+            <w:r/>
+            <w:r>
+              <w:rPr>
+                <w:sz w:val="18"/>
+              </w:rPr>
+              <w:t>Proveedores</w:t>
+            </w:r>
+          </w:p>
+        </w:tc>
+        <w:tc>
+          <w:tcPr>
+            <w:tcW w:type="dxa" w:w="2256"/>
+          </w:tcPr>
+          <w:p>
+            <w:r/>
+            <w:r>
+              <w:rPr>
+                <w:sz w:val="18"/>
+              </w:rPr>
+              <w:t>Uno a muchos (0..N)</w:t>
+            </w:r>
+          </w:p>
+        </w:tc>
+        <w:tc>
+          <w:tcPr>
+            <w:tcW w:type="dxa" w:w="2256"/>
+          </w:tcPr>
+          <w:p>
+            <w:r/>
+            <w:r>
+              <w:rPr>
+                <w:sz w:val="18"/>
+              </w:rPr>
+              <w:t>Factura Ingresos</w:t>
+            </w:r>
+          </w:p>
+        </w:tc>
+        <w:tc>
+          <w:tcPr>
+            <w:tcW w:type="dxa" w:w="2256"/>
+          </w:tcPr>
+          <w:p>
+            <w:r/>
+            <w:r>
+              <w:rPr>
+                <w:sz w:val="18"/>
+              </w:rPr>
+              <w:t>emite a</w:t>
+            </w:r>
+          </w:p>
+        </w:tc>
+      </w:tr>
+      <w:tr>
+        <w:tc>
+          <w:tcPr>
+            <w:tcW w:type="dxa" w:w="2256"/>
+          </w:tcPr>
+          <w:p>
+            <w:r/>
+            <w:r>
+              <w:rPr>
+                <w:sz w:val="18"/>
+              </w:rPr>
+              <w:t>Factura Ingresos</w:t>
+            </w:r>
+          </w:p>
+        </w:tc>
+        <w:tc>
+          <w:tcPr>
+            <w:tcW w:type="dxa" w:w="2256"/>
+          </w:tcPr>
+          <w:p>
+            <w:r/>
+            <w:r>
+              <w:rPr>
+                <w:sz w:val="18"/>
+              </w:rPr>
+              <w:t>Uno a muchos (1..N)</w:t>
+            </w:r>
+          </w:p>
+        </w:tc>
+        <w:tc>
+          <w:tcPr>
+            <w:tcW w:type="dxa" w:w="2256"/>
+          </w:tcPr>
+          <w:p>
+            <w:r/>
+            <w:r>
+              <w:rPr>
+                <w:sz w:val="18"/>
+              </w:rPr>
+              <w:t>Detalle Factura Ingresos</w:t>
+            </w:r>
+          </w:p>
+        </w:tc>
+        <w:tc>
+          <w:tcPr>
+            <w:tcW w:type="dxa" w:w="2256"/>
+          </w:tcPr>
+          <w:p>
+            <w:r/>
+            <w:r>
+              <w:rPr>
+                <w:sz w:val="18"/>
+              </w:rPr>
+              <w:t>desglosa en</w:t>
+            </w:r>
+          </w:p>
+        </w:tc>
+      </w:tr>
+      <w:tr>
+        <w:tc>
+          <w:tcPr>
+            <w:tcW w:type="dxa" w:w="2256"/>
+          </w:tcPr>
+          <w:p>
+            <w:r/>
+            <w:r>
+              <w:rPr>
+                <w:sz w:val="18"/>
+              </w:rPr>
+              <w:t>Productos</w:t>
+            </w:r>
+          </w:p>
+        </w:tc>
+        <w:tc>
+          <w:tcPr>
+            <w:tcW w:type="dxa" w:w="2256"/>
+          </w:tcPr>
+          <w:p>
+            <w:r/>
+            <w:r>
+              <w:rPr>
+                <w:sz w:val="18"/>
+              </w:rPr>
+              <w:t>Uno a muchos (0..N)</w:t>
+            </w:r>
+          </w:p>
+        </w:tc>
+        <w:tc>
+          <w:tcPr>
+            <w:tcW w:type="dxa" w:w="2256"/>
+          </w:tcPr>
+          <w:p>
+            <w:r/>
+            <w:r>
+              <w:rPr>
+                <w:sz w:val="18"/>
+              </w:rPr>
+              <w:t>Detalle Factura Ingresos</w:t>
+            </w:r>
+          </w:p>
+        </w:tc>
+        <w:tc>
+          <w:tcPr>
+            <w:tcW w:type="dxa" w:w="2256"/>
+          </w:tcPr>
+          <w:p>
+            <w:r/>
+            <w:r>
+              <w:rPr>
+                <w:sz w:val="18"/>
+              </w:rPr>
+              <w:t>comprado en</w:t>
+            </w:r>
+          </w:p>
+        </w:tc>
+      </w:tr>
+      <w:tr>
+        <w:tc>
+          <w:tcPr>
+            <w:tcW w:type="dxa" w:w="2256"/>
+          </w:tcPr>
+          <w:p>
+            <w:r/>
+            <w:r>
+              <w:rPr>
+                <w:sz w:val="18"/>
+              </w:rPr>
+              <w:t>Tenants</w:t>
+            </w:r>
+          </w:p>
+        </w:tc>
+        <w:tc>
+          <w:tcPr>
+            <w:tcW w:type="dxa" w:w="2256"/>
+          </w:tcPr>
+          <w:p>
+            <w:r/>
+            <w:r>
+              <w:rPr>
+                <w:sz w:val="18"/>
+              </w:rPr>
+              <w:t>Uno a muchos (0..N)</w:t>
+            </w:r>
+          </w:p>
+        </w:tc>
+        <w:tc>
+          <w:tcPr>
+            <w:tcW w:type="dxa" w:w="2256"/>
+          </w:tcPr>
+          <w:p>
+            <w:r/>
+            <w:r>
+              <w:rPr>
+                <w:sz w:val="18"/>
+              </w:rPr>
+              <w:t>Productos</w:t>
+            </w:r>
+          </w:p>
+        </w:tc>
+        <w:tc>
+          <w:tcPr>
+            <w:tcW w:type="dxa" w:w="2256"/>
+          </w:tcPr>
+          <w:p>
+            <w:r/>
+            <w:r>
+              <w:rPr>
+                <w:sz w:val="18"/>
+              </w:rPr>
+              <w:t>posee catalogo</w:t>
+            </w:r>
+          </w:p>
+        </w:tc>
+      </w:tr>
+      <w:tr>
+        <w:tc>
+          <w:tcPr>
+            <w:tcW w:type="dxa" w:w="2256"/>
+          </w:tcPr>
+          <w:p>
+            <w:r/>
+            <w:r>
+              <w:rPr>
+                <w:sz w:val="18"/>
+              </w:rPr>
+              <w:t>Proveedores</w:t>
+            </w:r>
+          </w:p>
+        </w:tc>
+        <w:tc>
+          <w:tcPr>
+            <w:tcW w:type="dxa" w:w="2256"/>
+          </w:tcPr>
+          <w:p>
+            <w:r/>
+            <w:r>
+              <w:rPr>
+                <w:sz w:val="18"/>
+              </w:rPr>
+              <w:t>Uno a muchos (0..N)</w:t>
+            </w:r>
+          </w:p>
+        </w:tc>
+        <w:tc>
+          <w:tcPr>
+            <w:tcW w:type="dxa" w:w="2256"/>
+          </w:tcPr>
+          <w:p>
+            <w:r/>
+            <w:r>
+              <w:rPr>
+                <w:sz w:val="18"/>
+              </w:rPr>
+              <w:t>Productos</w:t>
+            </w:r>
+          </w:p>
+        </w:tc>
+        <w:tc>
+          <w:tcPr>
+            <w:tcW w:type="dxa" w:w="2256"/>
+          </w:tcPr>
+          <w:p>
+            <w:r/>
+            <w:r>
+              <w:rPr>
+                <w:sz w:val="18"/>
+              </w:rPr>
+              <w:t>proveedor principal</w:t>
+            </w:r>
+          </w:p>
+        </w:tc>
+      </w:tr>
+      <w:tr>
+        <w:tc>
+          <w:tcPr>
+            <w:tcW w:type="dxa" w:w="2256"/>
+          </w:tcPr>
+          <w:p>
+            <w:r/>
+            <w:r>
+              <w:rPr>
+                <w:sz w:val="18"/>
+              </w:rPr>
+              <w:t>Productos</w:t>
+            </w:r>
+          </w:p>
+        </w:tc>
+        <w:tc>
+          <w:tcPr>
+            <w:tcW w:type="dxa" w:w="2256"/>
+          </w:tcPr>
+          <w:p>
+            <w:r/>
+            <w:r>
+              <w:rPr>
+                <w:sz w:val="18"/>
+              </w:rPr>
+              <w:t>Uno a muchos (0..N)</w:t>
+            </w:r>
+          </w:p>
+        </w:tc>
+        <w:tc>
+          <w:tcPr>
+            <w:tcW w:type="dxa" w:w="2256"/>
+          </w:tcPr>
+          <w:p>
+            <w:r/>
+            <w:r>
+              <w:rPr>
+                <w:sz w:val="18"/>
+              </w:rPr>
+              <w:t>Lotes</w:t>
+            </w:r>
+          </w:p>
+        </w:tc>
+        <w:tc>
+          <w:tcPr>
+            <w:tcW w:type="dxa" w:w="2256"/>
+          </w:tcPr>
+          <w:p>
+            <w:r/>
+            <w:r>
+              <w:rPr>
+                <w:sz w:val="18"/>
+              </w:rPr>
+              <w:t>controla vencimiento</w:t>
+            </w:r>
+          </w:p>
+        </w:tc>
+      </w:tr>
+      <w:tr>
+        <w:tc>
+          <w:tcPr>
+            <w:tcW w:type="dxa" w:w="2256"/>
+          </w:tcPr>
+          <w:p>
+            <w:r/>
+            <w:r>
+              <w:rPr>
+                <w:sz w:val="18"/>
+              </w:rPr>
+              <w:t>Productos</w:t>
+            </w:r>
+          </w:p>
+        </w:tc>
+        <w:tc>
+          <w:tcPr>
+            <w:tcW w:type="dxa" w:w="2256"/>
+          </w:tcPr>
+          <w:p>
+            <w:r/>
+            <w:r>
+              <w:rPr>
+                <w:sz w:val="18"/>
+              </w:rPr>
+              <w:t>Uno a muchos (0..N)</w:t>
+            </w:r>
+          </w:p>
+        </w:tc>
+        <w:tc>
+          <w:tcPr>
+            <w:tcW w:type="dxa" w:w="2256"/>
+          </w:tcPr>
+          <w:p>
+            <w:r/>
+            <w:r>
+              <w:rPr>
+                <w:sz w:val="18"/>
+              </w:rPr>
+              <w:t>Movimientos Inventario</w:t>
+            </w:r>
+          </w:p>
+        </w:tc>
+        <w:tc>
+          <w:tcPr>
+            <w:tcW w:type="dxa" w:w="2256"/>
+          </w:tcPr>
+          <w:p>
+            <w:r/>
+            <w:r>
+              <w:rPr>
+                <w:sz w:val="18"/>
+              </w:rPr>
+              <w:t>audita stock</w:t>
+            </w:r>
+          </w:p>
+        </w:tc>
+      </w:tr>
+      <w:tr>
+        <w:tc>
+          <w:tcPr>
+            <w:tcW w:type="dxa" w:w="2256"/>
+          </w:tcPr>
+          <w:p>
+            <w:r/>
+            <w:r>
+              <w:rPr>
+                <w:sz w:val="18"/>
+              </w:rPr>
+              <w:t>Movimientos Inventario Tipos</w:t>
+            </w:r>
+          </w:p>
+        </w:tc>
+        <w:tc>
+          <w:tcPr>
+            <w:tcW w:type="dxa" w:w="2256"/>
+          </w:tcPr>
+          <w:p>
+            <w:r/>
+            <w:r>
+              <w:rPr>
+                <w:sz w:val="18"/>
+              </w:rPr>
+              <w:t>Uno a muchos (0..N)</w:t>
+            </w:r>
+          </w:p>
+        </w:tc>
+        <w:tc>
+          <w:tcPr>
+            <w:tcW w:type="dxa" w:w="2256"/>
+          </w:tcPr>
+          <w:p>
+            <w:r/>
+            <w:r>
+              <w:rPr>
+                <w:sz w:val="18"/>
+              </w:rPr>
+              <w:t>Movimientos Inventario</w:t>
+            </w:r>
+          </w:p>
+        </w:tc>
+        <w:tc>
+          <w:tcPr>
+            <w:tcW w:type="dxa" w:w="2256"/>
+          </w:tcPr>
+          <w:p>
+            <w:r/>
+            <w:r>
+              <w:rPr>
+                <w:sz w:val="18"/>
+              </w:rPr>
+              <w:t>clasifica origen</w:t>
+            </w:r>
+          </w:p>
+        </w:tc>
+      </w:tr>
+      <w:tr>
+        <w:tc>
+          <w:tcPr>
+            <w:tcW w:type="dxa" w:w="2256"/>
+          </w:tcPr>
+          <w:p>
+            <w:r/>
+            <w:r>
+              <w:rPr>
+                <w:sz w:val="18"/>
+              </w:rPr>
+              <w:t>Usuarios</w:t>
+            </w:r>
+          </w:p>
+        </w:tc>
+        <w:tc>
+          <w:tcPr>
+            <w:tcW w:type="dxa" w:w="2256"/>
+          </w:tcPr>
+          <w:p>
+            <w:r/>
+            <w:r>
+              <w:rPr>
+                <w:sz w:val="18"/>
+              </w:rPr>
+              <w:t>Uno a muchos (0..N)</w:t>
+            </w:r>
+          </w:p>
+        </w:tc>
+        <w:tc>
+          <w:tcPr>
+            <w:tcW w:type="dxa" w:w="2256"/>
+          </w:tcPr>
+          <w:p>
+            <w:r/>
+            <w:r>
+              <w:rPr>
+                <w:sz w:val="18"/>
+              </w:rPr>
+              <w:t>Sesiones Caja</w:t>
+            </w:r>
+          </w:p>
+        </w:tc>
+        <w:tc>
+          <w:tcPr>
+            <w:tcW w:type="dxa" w:w="2256"/>
+          </w:tcPr>
+          <w:p>
+            <w:r/>
+            <w:r>
+              <w:rPr>
+                <w:sz w:val="18"/>
+              </w:rPr>
+              <w:t>opera caja</w:t>
+            </w:r>
+          </w:p>
+        </w:tc>
+      </w:tr>
+      <w:tr>
+        <w:tc>
+          <w:tcPr>
+            <w:tcW w:type="dxa" w:w="2256"/>
+          </w:tcPr>
+          <w:p>
+            <w:r/>
+            <w:r>
+              <w:rPr>
+                <w:sz w:val="18"/>
+              </w:rPr>
+              <w:t>Sesiones Caja</w:t>
+            </w:r>
+          </w:p>
+        </w:tc>
+        <w:tc>
+          <w:tcPr>
+            <w:tcW w:type="dxa" w:w="2256"/>
+          </w:tcPr>
+          <w:p>
+            <w:r/>
+            <w:r>
+              <w:rPr>
+                <w:sz w:val="18"/>
+              </w:rPr>
+              <w:t>Uno a muchos (0..N)</w:t>
+            </w:r>
+          </w:p>
+        </w:tc>
+        <w:tc>
+          <w:tcPr>
+            <w:tcW w:type="dxa" w:w="2256"/>
+          </w:tcPr>
+          <w:p>
+            <w:r/>
+            <w:r>
+              <w:rPr>
+                <w:sz w:val="18"/>
+              </w:rPr>
+              <w:t>Movimientos Caja</w:t>
+            </w:r>
+          </w:p>
+        </w:tc>
+        <w:tc>
+          <w:tcPr>
+            <w:tcW w:type="dxa" w:w="2256"/>
+          </w:tcPr>
+          <w:p>
+            <w:r/>
+            <w:r>
+              <w:rPr>
+                <w:sz w:val="18"/>
+              </w:rPr>
+              <w:t>entradas salidas</w:t>
+            </w:r>
+          </w:p>
+        </w:tc>
+      </w:tr>
+      <w:tr>
+        <w:tc>
+          <w:tcPr>
+            <w:tcW w:type="dxa" w:w="2256"/>
+          </w:tcPr>
+          <w:p>
+            <w:r/>
+            <w:r>
+              <w:rPr>
+                <w:sz w:val="18"/>
+              </w:rPr>
+              <w:t>Sesiones Caja</w:t>
+            </w:r>
+          </w:p>
+        </w:tc>
+        <w:tc>
+          <w:tcPr>
+            <w:tcW w:type="dxa" w:w="2256"/>
+          </w:tcPr>
+          <w:p>
+            <w:r/>
+            <w:r>
+              <w:rPr>
+                <w:sz w:val="18"/>
+              </w:rPr>
+              <w:t>Uno a muchos (0..N)</w:t>
+            </w:r>
+          </w:p>
+        </w:tc>
+        <w:tc>
+          <w:tcPr>
+            <w:tcW w:type="dxa" w:w="2256"/>
+          </w:tcPr>
+          <w:p>
+            <w:r/>
+            <w:r>
+              <w:rPr>
+                <w:sz w:val="18"/>
+              </w:rPr>
+              <w:t>Transacciones Venta</w:t>
+            </w:r>
+          </w:p>
+        </w:tc>
+        <w:tc>
+          <w:tcPr>
+            <w:tcW w:type="dxa" w:w="2256"/>
+          </w:tcPr>
+          <w:p>
+            <w:r/>
+            <w:r>
+              <w:rPr>
+                <w:sz w:val="18"/>
+              </w:rPr>
+              <w:t>contiene ventas</w:t>
+            </w:r>
+          </w:p>
+        </w:tc>
+      </w:tr>
+      <w:tr>
+        <w:tc>
+          <w:tcPr>
+            <w:tcW w:type="dxa" w:w="2256"/>
+          </w:tcPr>
+          <w:p>
+            <w:r/>
+            <w:r>
+              <w:rPr>
+                <w:sz w:val="18"/>
+              </w:rPr>
+              <w:t>Transacciones Venta</w:t>
+            </w:r>
+          </w:p>
+        </w:tc>
+        <w:tc>
+          <w:tcPr>
+            <w:tcW w:type="dxa" w:w="2256"/>
+          </w:tcPr>
+          <w:p>
+            <w:r/>
+            <w:r>
+              <w:rPr>
+                <w:sz w:val="18"/>
+              </w:rPr>
+              <w:t>Uno a muchos (1..N)</w:t>
+            </w:r>
+          </w:p>
+        </w:tc>
+        <w:tc>
+          <w:tcPr>
+            <w:tcW w:type="dxa" w:w="2256"/>
+          </w:tcPr>
+          <w:p>
+            <w:r/>
+            <w:r>
+              <w:rPr>
+                <w:sz w:val="18"/>
+              </w:rPr>
+              <w:t>Detalle Venta</w:t>
+            </w:r>
+          </w:p>
+        </w:tc>
+        <w:tc>
+          <w:tcPr>
+            <w:tcW w:type="dxa" w:w="2256"/>
+          </w:tcPr>
+          <w:p>
+            <w:r/>
+            <w:r>
+              <w:rPr>
+                <w:sz w:val="18"/>
+              </w:rPr>
+              <w:t>desglosa en</w:t>
+            </w:r>
+          </w:p>
+        </w:tc>
+      </w:tr>
+      <w:tr>
+        <w:tc>
+          <w:tcPr>
+            <w:tcW w:type="dxa" w:w="2256"/>
+          </w:tcPr>
+          <w:p>
+            <w:r/>
+            <w:r>
+              <w:rPr>
+                <w:sz w:val="18"/>
+              </w:rPr>
+              <w:t>Productos</w:t>
+            </w:r>
+          </w:p>
+        </w:tc>
+        <w:tc>
+          <w:tcPr>
+            <w:tcW w:type="dxa" w:w="2256"/>
+          </w:tcPr>
+          <w:p>
+            <w:r/>
+            <w:r>
+              <w:rPr>
+                <w:sz w:val="18"/>
+              </w:rPr>
+              <w:t>Uno a muchos (0..N)</w:t>
+            </w:r>
+          </w:p>
+        </w:tc>
+        <w:tc>
+          <w:tcPr>
+            <w:tcW w:type="dxa" w:w="2256"/>
+          </w:tcPr>
+          <w:p>
+            <w:r/>
+            <w:r>
+              <w:rPr>
+                <w:sz w:val="18"/>
+              </w:rPr>
+              <w:t>Detalle Venta</w:t>
+            </w:r>
+          </w:p>
+        </w:tc>
+        <w:tc>
+          <w:tcPr>
+            <w:tcW w:type="dxa" w:w="2256"/>
+          </w:tcPr>
+          <w:p>
+            <w:r/>
+            <w:r>
+              <w:rPr>
+                <w:sz w:val="18"/>
+              </w:rPr>
+              <w:t>se vende en</w:t>
+            </w:r>
+          </w:p>
+        </w:tc>
+      </w:tr>
+      <w:tr>
+        <w:tc>
+          <w:tcPr>
+            <w:tcW w:type="dxa" w:w="2256"/>
+          </w:tcPr>
+          <w:p>
+            <w:r/>
+            <w:r>
+              <w:rPr>
+                <w:sz w:val="18"/>
+              </w:rPr>
+              <w:t>Metodos Pago</w:t>
+            </w:r>
+          </w:p>
+        </w:tc>
+        <w:tc>
+          <w:tcPr>
+            <w:tcW w:type="dxa" w:w="2256"/>
+          </w:tcPr>
+          <w:p>
+            <w:r/>
+            <w:r>
+              <w:rPr>
+                <w:sz w:val="18"/>
+              </w:rPr>
+              <w:t>Uno a muchos (0..N)</w:t>
+            </w:r>
+          </w:p>
+        </w:tc>
+        <w:tc>
+          <w:tcPr>
+            <w:tcW w:type="dxa" w:w="2256"/>
+          </w:tcPr>
+          <w:p>
+            <w:r/>
+            <w:r>
+              <w:rPr>
+                <w:sz w:val="18"/>
+              </w:rPr>
+              <w:t>Transacciones Venta</w:t>
+            </w:r>
+          </w:p>
+        </w:tc>
+        <w:tc>
+          <w:tcPr>
+            <w:tcW w:type="dxa" w:w="2256"/>
+          </w:tcPr>
+          <w:p>
+            <w:r/>
+            <w:r>
+              <w:rPr>
+                <w:sz w:val="18"/>
+              </w:rPr>
+              <w:t>paga con</w:t>
+            </w:r>
+          </w:p>
+        </w:tc>
+      </w:tr>
+    </w:tbl>
+    <w:p>
+      <w:r>
+        <w:rPr>
+          <w:rFonts w:ascii="Calibri" w:hAnsi="Calibri"/>
+          <w:sz w:val="21"/>
+        </w:rPr>
+        <w:t>Las llaves primarias son identificadores universales (UUID en PostgreSQL, TEXT en SQLite) y las llaves foraneas se declaran con integridad referencial activa en ambos motores. El esquema emplea tres politicas de borrado, con 49 declaraciones en total: 36 ON DELETE CASCADE en las entidades dependientes de un comercio, de modo que la baja de una cuenta arrastra su informacion asociada; 7 ON DELETE RESTRICT donde la eliminacion comprometeria un registro ya emitido, como el plan de facturacion de un comercio activo, el tipo de un movimiento de inventario o el usuario que firmo una venta; y 6 ON DELETE SET NULL donde la referencia es informativa y su perdida no invalida el registro que la contiene.</w:t>
       </w:r>
     </w:p>
     <w:sectPr>

</xml_diff>